<commit_message>
Regenerate the report from the corrected facts
17 sections, 14 figures, 15 tables, every number read from facts.json.
Checked for leaked markdown markers in the output: none.
</commit_message>
<xml_diff>
--- a/AryanVerma_ProjectReport.docx
+++ b/AryanVerma_ProjectReport.docx
@@ -584,7 +584,7 @@
           <w:color w:val="77776F"/>
           <w:sz w:val="18"/>
         </w:rPr>
-        <w:t xml:space="preserve">Every figure, table and number in this report is computed by the notebook and read from </w:t>
+        <w:t xml:space="preserve">Every figure, table and result in this report is computed by the notebook and read from </w:t>
       </w:r>
       <w:r>
         <w:rPr>
@@ -603,7 +603,7 @@
           <w:color w:val="77776F"/>
           <w:sz w:val="18"/>
         </w:rPr>
-        <w:t>. Nothing is transcribed by hand.</w:t>
+        <w:t>; the software versions are read from the run itself. The only hand-entered values are the wall-clock timings in section 16.</w:t>
       </w:r>
     </w:p>
     <w:p>
@@ -906,7 +906,7 @@
           <w:b/>
           <w:i w:val="0"/>
         </w:rPr>
-        <w:t>1,170 customers - 20% of the base - produce 77.2% of revenue, and the top 1% (58 customers) produce 31.9%.</w:t>
+        <w:t>1,170 customers - 20% of the base - produce 77.2% of identified revenue, and the top 1% (58 customers) produce 31.9%.</w:t>
       </w:r>
       <w:r>
         <w:rPr>
@@ -936,7 +936,7 @@
           <w:b w:val="0"/>
           <w:i w:val="0"/>
         </w:rPr>
-        <w:t xml:space="preserve"> A K-Means clustering run on the same log-scaled RFM features, given no rules at all, reproduces that structure: every one of the nine segments sends at least 60% of its members to a single cluster. Two independent methods agreeing is evidence the structure is in the data rather than in the thresholds.</w:t>
+        <w:t xml:space="preserve"> A K-Means clustering run on the same log-scaled RFM features, given no rules at all, reproduces that structure: every one of the nine segments sends at least 60% of its members to a single cluster, and 80.5% of customers land in their own segment's modal cluster. Two methods that read the same features but draw their boundaries differently agreeing is evidence the structure is in the data rather than in the thresholds.</w:t>
       </w:r>
     </w:p>
     <w:p>
@@ -952,7 +952,7 @@
           <w:b/>
           <w:i w:val="0"/>
         </w:rPr>
-        <w:t>683 customers who have already spent £1,689,620 (9.6% of revenue) have stopped ordering.</w:t>
+        <w:t>683 customers who have already spent £1,689,620 (9.6% of identified revenue) have stopped ordering.</w:t>
       </w:r>
       <w:r>
         <w:rPr>
@@ -968,21 +968,21 @@
           <w:b w:val="0"/>
           <w:i w:val="0"/>
         </w:rPr>
-        <w:t xml:space="preserve">Three further results change how the business should read its own reports. Returns total £1,523,788 - 7.43% of gross revenue - and the rate spikes to 19.05% in January 2011 rather than sitting flat. The single largest line in the file, £168,470 of one product, was cancelled 12 minutes after it was raised, which moves that product from </w:t>
+        <w:t xml:space="preserve">Three further results change how the business should read its own reports. Returns total £738,952 - 3.60% of gross revenue - and the rate spikes to 13.30% in January 2011 rather than sitting flat. The single largest line in the file, £168,470 of one product, was cancelled 12 minutes after it was raised, which moves that product from </w:t>
       </w:r>
       <w:r>
         <w:rPr>
           <w:b/>
           <w:i w:val="0"/>
         </w:rPr>
-        <w:t>gross rank 3 to net rank 5,320</w:t>
+        <w:t>gross rank 4 to net rank 4,711</w:t>
       </w:r>
       <w:r>
         <w:rPr>
           <w:b w:val="0"/>
           <w:i w:val="0"/>
         </w:rPr>
-        <w:t>; 8 of the top ten products change position once cancellations are netted off. And customers acquired in the Christmas peak retain at 9.3% by month 3 against 21.9% for every other month - the season that produces the revenue produces the worst customers.</w:t>
+        <w:t>; 7 of the top ten products change position once cancellations are netted off. And customers acquired in the Christmas peak retain at 9.3% by month 3 against 22.3% for every other month - on 2 peak cohorts from a single season, so a lead to test rather than a settled fact.</w:t>
       </w:r>
     </w:p>
     <w:p>
@@ -1617,7 +1617,7 @@
           <w:b w:val="0"/>
           <w:i w:val="0"/>
         </w:rPr>
-        <w:t xml:space="preserve"> a return; and the timestamp records back-office keying rather than customer intent, so it cannot say when customers prefer to shop. Section 14 states all nine limitations in full.</w:t>
+        <w:t xml:space="preserve"> a return; and the timestamp records back-office keying rather than customer intent, so it cannot say when customers prefer to shop. Section 14 states all 11 limitations in full.</w:t>
       </w:r>
     </w:p>
     <w:p>
@@ -2396,7 +2396,7 @@
                 <w:b w:val="0"/>
                 <w:sz w:val="19"/>
               </w:rPr>
-              <w:t>approx. 45 MB compressed download</w:t>
+              <w:t>45.6 MB download (a stored .zip holding one .xlsx of the same size)</w:t>
             </w:r>
           </w:p>
         </w:tc>
@@ -3620,14 +3620,14 @@
           <w:b/>
           <w:i w:val="0"/>
         </w:rPr>
-        <w:t>6,202 rows have a zero or negative price</w:t>
+        <w:t>6,202 rows are priced at zero and 5 carry a negative price</w:t>
       </w:r>
       <w:r>
         <w:rPr>
           <w:b w:val="0"/>
           <w:i w:val="0"/>
         </w:rPr>
-        <w:t>, including every row with a blank description.</w:t>
+        <w:t>, the zero-priced set including every row with a blank description.</w:t>
       </w:r>
     </w:p>
     <w:p>
@@ -3675,7 +3675,7 @@
           <w:color w:val="77776F"/>
           <w:sz w:val="17"/>
         </w:rPr>
-        <w:t>Table 5. Software stack. Exact pinned lower bounds are in requirements.txt.</w:t>
+        <w:t>Table 5. Software stack. Every version is the one that actually produced these results, read from the run itself; the lower bounds are in requirements.txt.</w:t>
       </w:r>
     </w:p>
     <w:tbl>
@@ -4527,7 +4527,7 @@
           <w:b w:val="0"/>
           <w:i w:val="0"/>
         </w:rPr>
-        <w:t xml:space="preserve"> - the complete analysis: 75 cells, all executed, no errors.</w:t>
+        <w:t xml:space="preserve"> - the complete analysis: 77 cells (47 code), all executed, no errors.</w:t>
       </w:r>
     </w:p>
     <w:p>
@@ -4802,7 +4802,7 @@
           <w:b w:val="0"/>
           <w:i w:val="0"/>
         </w:rPr>
-        <w:t xml:space="preserve"> - the subset with a known customer ID: 792,828 rows, £17,528,150, which is 85.4% of clean revenue. Used for RFM, K-Means, CLV and cohorts, because all four need an identified customer.</w:t>
+        <w:t xml:space="preserve"> - the subset with a known customer ID: 792,828 rows, £17,528,150, which is 85.4% of clean revenue. Used for RFM, K-Means, CLV and cohorts, because all four need an identified customer, and therefore the base every customer-level share in this report is measured against.</w:t>
       </w:r>
     </w:p>
     <w:p>
@@ -4811,7 +4811,7 @@
           <w:b w:val="0"/>
           <w:i w:val="0"/>
         </w:rPr>
-        <w:t xml:space="preserve">Cancellations (19,494 rows) and stock write-offs (3,457 rows) are </w:t>
+        <w:t xml:space="preserve">Cancellations (19,433 rows - the 19,494 in the raw file less the exact duplicates step 2 removed) and stock write-offs (3,457 rows) are </w:t>
       </w:r>
       <w:r>
         <w:rPr>
@@ -4900,7 +4900,7 @@
           <w:b w:val="0"/>
           <w:i w:val="0"/>
         </w:rPr>
-        <w:t xml:space="preserve">The same three features are clustered without any rules, as an independent check. Because recency, frequency and monetary value are all heavily right-skewed, each is </w:t>
+        <w:t xml:space="preserve">The same three features are clustered without any rules, as a check on whether the segment boundaries are a property of the data or of the chosen thresholds. Because recency, frequency and monetary value are all heavily right-skewed, each is </w:t>
       </w:r>
       <w:r>
         <w:rPr>
@@ -6781,7 +6781,7 @@
           <w:b w:val="0"/>
           <w:i w:val="0"/>
         </w:rPr>
-        <w:t xml:space="preserve"> The peak month is November 2011 at £1,500,524; the trough is February 2011 at £521,308, which is less than 35% of the peak. Comparing the two like-for-like trading years, revenue grew 8.1%, from £9,555,256 to £10,324,943.</w:t>
+        <w:t xml:space="preserve"> The peak month is November 2011 at £1,500,524; the trough is February 2011 at £521,308, which is 34.7% of the peak. Comparing the two like-for-like trading years, revenue grew 8.1%, from £9,555,256 to £10,324,943.</w:t>
       </w:r>
     </w:p>
     <w:p>
@@ -6862,21 +6862,109 @@
           <w:b w:val="0"/>
           <w:i w:val="0"/>
         </w:rPr>
-        <w:t xml:space="preserve">The growth is not coming from acquisition. </w:t>
+        <w:t xml:space="preserve">Repeat buying dominates the revenue </w:t>
+      </w:r>
+      <w:r>
+        <w:rPr>
+          <w:b w:val="0"/>
+          <w:i/>
+        </w:rPr>
+        <w:t>level</w:t>
+      </w:r>
+      <w:r>
+        <w:rPr>
+          <w:b w:val="0"/>
+          <w:i w:val="0"/>
+        </w:rPr>
+        <w:t xml:space="preserve">. </w:t>
       </w:r>
       <w:r>
         <w:rPr>
           <w:b/>
           <w:i w:val="0"/>
         </w:rPr>
-        <w:t>In the second year, 91.6% of identified revenue came from customers acquired earlier</w:t>
+        <w:t>In the second year - the twelve full months from December 2010 to November 2011, the truncated final month excluded - 91.3% of identified revenue came from customers who had already ordered in an earlier month</w:t>
       </w:r>
       <w:r>
         <w:rPr>
           <w:b w:val="0"/>
           <w:i w:val="0"/>
         </w:rPr>
-        <w:t>; new customers contributed the remaining 8.4%. That single split reframes the whole analysis: the existing base is the growth engine, so losing part of it is more expensive than failing to add to it.</w:t>
+        <w:t>; only 8.7% came from customers in their very first month.</w:t>
+      </w:r>
+    </w:p>
+    <w:p>
+      <w:r>
+        <w:rPr>
+          <w:b w:val="0"/>
+          <w:i w:val="0"/>
+        </w:rPr>
+        <w:t xml:space="preserve">That figure is a month-level flag, not a cohort split: a customer counts as returning in every month after the one they first appear in, including later months of the same year they were acquired. Read as "the second year was carried by the customers we already had" it would be wrong, so the same window is also split by </w:t>
+      </w:r>
+      <w:r>
+        <w:rPr>
+          <w:b/>
+          <w:i w:val="0"/>
+        </w:rPr>
+        <w:t>acquisition cohort</w:t>
+      </w:r>
+      <w:r>
+        <w:rPr>
+          <w:b w:val="0"/>
+          <w:i w:val="0"/>
+        </w:rPr>
+        <w:t>. Customers acquired before the second year began supplied 82.7% of its revenue and customers first acquired during it supplied 17.3%.</w:t>
+      </w:r>
+    </w:p>
+    <w:p>
+      <w:r>
+        <w:rPr>
+          <w:b w:val="0"/>
+          <w:i w:val="0"/>
+        </w:rPr>
+        <w:t xml:space="preserve">The direction of the </w:t>
+      </w:r>
+      <w:r>
+        <w:rPr>
+          <w:b w:val="0"/>
+          <w:i/>
+        </w:rPr>
+        <w:t>growth</w:t>
+      </w:r>
+      <w:r>
+        <w:rPr>
+          <w:b w:val="0"/>
+          <w:i w:val="0"/>
+        </w:rPr>
+        <w:t xml:space="preserve"> is the opposite of what the first figure suggests. Identified revenue rose from £8,384,041 to £8,627,354 - </w:t>
+      </w:r>
+      <w:r>
+        <w:rPr>
+          <w:b/>
+          <w:i w:val="0"/>
+        </w:rPr>
+        <w:t>£243,313, 2.9%</w:t>
+      </w:r>
+      <w:r>
+        <w:rPr>
+          <w:b w:val="0"/>
+          <w:i w:val="0"/>
+        </w:rPr>
+        <w:t xml:space="preserve"> - and that net movement is </w:t>
+      </w:r>
+      <w:r>
+        <w:rPr>
+          <w:b/>
+          <w:i w:val="0"/>
+        </w:rPr>
+        <w:t>£1,491,334 added by customers acquired during the year, against a £1,248,022 decline in the base that already existed.</w:t>
+      </w:r>
+      <w:r>
+        <w:rPr>
+          <w:b w:val="0"/>
+          <w:i w:val="0"/>
+        </w:rPr>
+        <w:t xml:space="preserve"> New acquisition did not top up a growing base; it covered a shrinking one. The existing base is still where the money is - more than four fifths of it - which is what makes the at-risk pool in section 8 expensive, but the case for defending it is that it is leaking, not that it is compounding.</w:t>
       </w:r>
     </w:p>
     <w:p>
@@ -7072,7 +7160,7 @@
           <w:color w:val="77776F"/>
           <w:sz w:val="17"/>
         </w:rPr>
-        <w:t>Table 7. Top ten products by merchandise revenue.</w:t>
+        <w:t>Table 7. Top ten products by merchandise revenue, out of 4,725 stock codes.</w:t>
       </w:r>
     </w:p>
     <w:tbl>
@@ -7400,7 +7488,7 @@
                 <w:b w:val="0"/>
                 <w:sz w:val="17"/>
               </w:rPr>
-              <w:t>£266,582</w:t>
+              <w:t>£266,761</w:t>
             </w:r>
           </w:p>
         </w:tc>
@@ -7426,7 +7514,7 @@
                 <w:b w:val="0"/>
                 <w:sz w:val="17"/>
               </w:rPr>
-              <w:t>96,563</w:t>
+              <w:t>96,624</w:t>
             </w:r>
           </w:p>
         </w:tc>
@@ -7452,7 +7540,7 @@
                 <w:b w:val="0"/>
                 <w:sz w:val="17"/>
               </w:rPr>
-              <w:t>5,455</w:t>
+              <w:t>5,464</w:t>
             </w:r>
           </w:p>
         </w:tc>
@@ -7505,7 +7593,7 @@
                 <w:b w:val="0"/>
                 <w:sz w:val="17"/>
               </w:rPr>
-              <w:t>Paper Craft , Little Birdie</w:t>
+              <w:t>Jumbo Bag Red Retrospot</w:t>
             </w:r>
           </w:p>
         </w:tc>
@@ -7531,7 +7619,7 @@
                 <w:b w:val="0"/>
                 <w:sz w:val="17"/>
               </w:rPr>
-              <w:t>£168,470</w:t>
+              <w:t>£185,248</w:t>
             </w:r>
           </w:p>
         </w:tc>
@@ -7557,7 +7645,7 @@
                 <w:b w:val="0"/>
                 <w:sz w:val="17"/>
               </w:rPr>
-              <w:t>80,995</w:t>
+              <w:t>98,594</w:t>
             </w:r>
           </w:p>
         </w:tc>
@@ -7583,7 +7671,7 @@
                 <w:b w:val="0"/>
                 <w:sz w:val="17"/>
               </w:rPr>
-              <w:t>1</w:t>
+              <w:t>4,013</w:t>
             </w:r>
           </w:p>
         </w:tc>
@@ -7609,7 +7697,7 @@
                 <w:b w:val="0"/>
                 <w:sz w:val="17"/>
               </w:rPr>
-              <w:t>0.84%</w:t>
+              <w:t>0.92%</w:t>
             </w:r>
           </w:p>
         </w:tc>
@@ -7636,7 +7724,7 @@
                 <w:b w:val="0"/>
                 <w:sz w:val="17"/>
               </w:rPr>
-              <w:t>Jumbo Bag Red Retrospot</w:t>
+              <w:t>Paper Craft , Little Birdie</w:t>
             </w:r>
           </w:p>
         </w:tc>
@@ -7662,7 +7750,7 @@
                 <w:b w:val="0"/>
                 <w:sz w:val="17"/>
               </w:rPr>
-              <w:t>£150,640</w:t>
+              <w:t>£168,470</w:t>
             </w:r>
           </w:p>
         </w:tc>
@@ -7688,7 +7776,7 @@
                 <w:b w:val="0"/>
                 <w:sz w:val="17"/>
               </w:rPr>
-              <w:t>79,117</w:t>
+              <w:t>80,995</w:t>
             </w:r>
           </w:p>
         </w:tc>
@@ -7714,7 +7802,7 @@
                 <w:b w:val="0"/>
                 <w:sz w:val="17"/>
               </w:rPr>
-              <w:t>3,269</w:t>
+              <w:t>1</w:t>
             </w:r>
           </w:p>
         </w:tc>
@@ -7740,7 +7828,7 @@
                 <w:b w:val="0"/>
                 <w:sz w:val="17"/>
               </w:rPr>
-              <w:t>0.75%</w:t>
+              <w:t>0.84%</w:t>
             </w:r>
           </w:p>
         </w:tc>
@@ -8422,7 +8510,7 @@
                 <w:b w:val="0"/>
                 <w:sz w:val="17"/>
               </w:rPr>
-              <w:t>Rotating Silver Angels T-Light Hldr</w:t>
+              <w:t>Small Popcorn Holder</w:t>
             </w:r>
           </w:p>
         </w:tc>
@@ -8448,7 +8536,7 @@
                 <w:b w:val="0"/>
                 <w:sz w:val="17"/>
               </w:rPr>
-              <w:t>£74,380</w:t>
+              <w:t>£80,888</w:t>
             </w:r>
           </w:p>
         </w:tc>
@@ -8474,7 +8562,7 @@
                 <w:b w:val="0"/>
                 <w:sz w:val="17"/>
               </w:rPr>
-              <w:t>32,498</w:t>
+              <w:t>89,860</w:t>
             </w:r>
           </w:p>
         </w:tc>
@@ -8500,7 +8588,7 @@
                 <w:b w:val="0"/>
                 <w:sz w:val="17"/>
               </w:rPr>
-              <w:t>756</w:t>
+              <w:t>2,322</w:t>
             </w:r>
           </w:p>
         </w:tc>
@@ -8526,7 +8614,7 @@
                 <w:b w:val="0"/>
                 <w:sz w:val="17"/>
               </w:rPr>
-              <w:t>0.37%</w:t>
+              <w:t>0.40%</w:t>
             </w:r>
           </w:p>
         </w:tc>
@@ -8553,14 +8641,14 @@
           <w:b w:val="0"/>
           <w:i w:val="0"/>
         </w:rPr>
-        <w:t xml:space="preserve">. The ten largest products together are 7.85% of merchandise revenue, which sounds small until it is compared with a uniform expectation: ten products out of 4,725 is 0.21% of the catalogue, so those ten are </w:t>
+        <w:t xml:space="preserve">. The ten largest products together are 8.06% of merchandise revenue, which sounds small until it is compared with a uniform expectation: ten products out of 4,725 is 0.21% of the catalogue, so those ten are </w:t>
       </w:r>
       <w:r>
         <w:rPr>
           <w:b/>
           <w:i w:val="0"/>
         </w:rPr>
-        <w:t>over-represented by 37.1x</w:t>
+        <w:t>over-represented by 38.1x</w:t>
       </w:r>
       <w:r>
         <w:rPr>
@@ -8576,7 +8664,48 @@
           <w:b w:val="0"/>
           <w:i w:val="0"/>
         </w:rPr>
-        <w:t>Revenue and volume are also not the same ranking. Only 5 of the top ten products by revenue also appear in the top ten by units sold - the rest are either cheap products sold in enormous quantity or expensive products sold steadily. A buying team optimising on units and a finance team optimising on revenue would pick different winners.</w:t>
+        <w:t xml:space="preserve">Products are aggregated on </w:t>
+      </w:r>
+      <w:r>
+        <w:rPr>
+          <w:rFonts w:ascii="Consolas" w:hAnsi="Consolas"/>
+          <w:b w:val="0"/>
+          <w:i w:val="0"/>
+          <w:sz w:val="19"/>
+        </w:rPr>
+        <w:t>StockCode</w:t>
+      </w:r>
+      <w:r>
+        <w:rPr>
+          <w:b w:val="0"/>
+          <w:i w:val="0"/>
+        </w:rPr>
+        <w:t xml:space="preserve">, not on </w:t>
+      </w:r>
+      <w:r>
+        <w:rPr>
+          <w:rFonts w:ascii="Consolas" w:hAnsi="Consolas"/>
+          <w:b w:val="0"/>
+          <w:i w:val="0"/>
+          <w:sz w:val="19"/>
+        </w:rPr>
+        <w:t>Description</w:t>
+      </w:r>
+      <w:r>
+        <w:rPr>
+          <w:b w:val="0"/>
+          <w:i w:val="0"/>
+        </w:rPr>
+        <w:t>. The 4,725 merchandise codes carry 5,336 distinct descriptions, so the same physical product is spelled more than one way; grouping on the text splits one product's revenue across its spellings and, in this file, moves a genuine top-three line down to fourth place. Every rank in this section and in section 7.7 is therefore a rank among 4,725 codes.</w:t>
+      </w:r>
+    </w:p>
+    <w:p>
+      <w:r>
+        <w:rPr>
+          <w:b w:val="0"/>
+          <w:i w:val="0"/>
+        </w:rPr>
+        <w:t>Revenue and volume are also not the same ranking. Only 6 of the top ten products by revenue also appear in the top ten by units sold - the rest are either cheap products sold in enormous quantity or expensive products sold steadily. A buying team optimising on units and a finance team optimising on revenue would pick different winners.</w:t>
       </w:r>
     </w:p>
     <w:p>
@@ -10841,21 +10970,21 @@
           <w:b w:val="0"/>
           <w:i w:val="0"/>
         </w:rPr>
-        <w:t xml:space="preserve">Returns total </w:t>
+        <w:t xml:space="preserve">Customer returns total </w:t>
       </w:r>
       <w:r>
         <w:rPr>
           <w:b/>
           <w:i w:val="0"/>
         </w:rPr>
-        <w:t>£1,523,788 across 19,432 lines - 7.43% of gross revenue</w:t>
+        <w:t>£738,952 across 18,467 lines - 3.60% of gross revenue</w:t>
       </w:r>
       <w:r>
         <w:rPr>
           <w:b w:val="0"/>
           <w:i w:val="0"/>
         </w:rPr>
-        <w:t>, taking £20.52M down to a net £18.99M. 2,572 customers returned something at least once.</w:t>
+        <w:t>, taking £20.52M down to a net £19.78M. 2,465 customers returned something at least once.</w:t>
       </w:r>
     </w:p>
     <w:p>
@@ -10864,14 +10993,55 @@
           <w:b w:val="0"/>
           <w:i w:val="0"/>
         </w:rPr>
-        <w:t xml:space="preserve">The aggregate rate hides the pattern. The monthly rate averages 6.8% but </w:t>
+        <w:t xml:space="preserve">A return rate is a ratio, so both sides of it have to count the same population, and getting that wrong here roughly doubles the answer. The credit notes set aside in cleaning step 3 come to £1,523,788 across 19,432 lines, but £784,837 of that - 965 lines - is administrative rather than a customer sending goods back: </w:t>
+      </w:r>
+      <w:r>
+        <w:rPr>
+          <w:rFonts w:ascii="Consolas" w:hAnsi="Consolas"/>
+          <w:b w:val="0"/>
+          <w:i w:val="0"/>
+          <w:sz w:val="19"/>
+        </w:rPr>
+        <w:t>MANUAL</w:t>
+      </w:r>
+      <w:r>
+        <w:rPr>
+          <w:b w:val="0"/>
+          <w:i w:val="0"/>
+        </w:rPr>
+        <w:t xml:space="preserve"> adjustments, </w:t>
+      </w:r>
+      <w:r>
+        <w:rPr>
+          <w:rFonts w:ascii="Consolas" w:hAnsi="Consolas"/>
+          <w:b w:val="0"/>
+          <w:i w:val="0"/>
+          <w:sz w:val="19"/>
+        </w:rPr>
+        <w:t>AMAZONFEE</w:t>
+      </w:r>
+      <w:r>
+        <w:rPr>
+          <w:b w:val="0"/>
+          <w:i w:val="0"/>
+        </w:rPr>
+        <w:t>, bank charges, discounts, charity lines and samples. Cleaning step 7 removes exactly those stock codes from the revenue base, so counting them in the numerator while the denominator excludes them would divide one population by another. Including them would report 7.43% rather than 3.60%. They are real money and are itemised in the notebook, but they are not returns.</w:t>
+      </w:r>
+    </w:p>
+    <w:p>
+      <w:r>
+        <w:rPr>
+          <w:b w:val="0"/>
+          <w:i w:val="0"/>
+        </w:rPr>
+        <w:t xml:space="preserve">The aggregate rate hides the pattern. The monthly rate averages 3.0% but </w:t>
       </w:r>
       <w:r>
         <w:rPr>
           <w:b/>
           <w:i w:val="0"/>
         </w:rPr>
-        <w:t>spikes to 19.05% in January 2011</w:t>
+        <w:t>spikes to 13.30% in January 2011</w:t>
       </w:r>
       <w:r>
         <w:rPr>
@@ -11564,7 +11734,7 @@
                 <w:b w:val="0"/>
                 <w:sz w:val="17"/>
               </w:rPr>
-              <w:t>£266,582</w:t>
+              <w:t>£266,761</w:t>
             </w:r>
           </w:p>
         </w:tc>
@@ -11669,7 +11839,7 @@
                 <w:b w:val="0"/>
                 <w:sz w:val="17"/>
               </w:rPr>
-              <w:t>£6,976</w:t>
+              <w:t>£7,174</w:t>
             </w:r>
           </w:p>
         </w:tc>
@@ -11695,7 +11865,7 @@
                 <w:b w:val="0"/>
                 <w:sz w:val="17"/>
               </w:rPr>
-              <w:t>£42,938</w:t>
+              <w:t>£46,519</w:t>
             </w:r>
           </w:p>
         </w:tc>
@@ -11721,7 +11891,7 @@
                 <w:b w:val="0"/>
                 <w:sz w:val="17"/>
               </w:rPr>
-              <w:t>16.2%</w:t>
+              <w:t>15.4%</w:t>
             </w:r>
           </w:p>
         </w:tc>
@@ -11747,7 +11917,7 @@
                 <w:b w:val="0"/>
                 <w:sz w:val="17"/>
               </w:rPr>
-              <w:t>63</w:t>
+              <w:t>70</w:t>
             </w:r>
           </w:p>
         </w:tc>
@@ -12036,7 +12206,7 @@
                 <w:b w:val="0"/>
                 <w:sz w:val="17"/>
               </w:rPr>
-              <w:t>Set/4 White Retro Storage Cubes</w:t>
+              <w:t>Red Retrospot Cake Stand</w:t>
             </w:r>
           </w:p>
         </w:tc>
@@ -12062,7 +12232,7 @@
                 <w:b w:val="0"/>
                 <w:sz w:val="17"/>
               </w:rPr>
-              <w:t>£5,188</w:t>
+              <w:t>£5,402</w:t>
             </w:r>
           </w:p>
         </w:tc>
@@ -12088,7 +12258,7 @@
                 <w:b w:val="0"/>
                 <w:sz w:val="17"/>
               </w:rPr>
-              <w:t>£43,922</w:t>
+              <w:t>£66,349</w:t>
             </w:r>
           </w:p>
         </w:tc>
@@ -12114,7 +12284,7 @@
                 <w:b w:val="0"/>
                 <w:sz w:val="17"/>
               </w:rPr>
-              <w:t>11.8%</w:t>
+              <w:t>8.1%</w:t>
             </w:r>
           </w:p>
         </w:tc>
@@ -12140,7 +12310,7 @@
                 <w:b w:val="0"/>
                 <w:sz w:val="17"/>
               </w:rPr>
-              <w:t>20</w:t>
+              <w:t>159</w:t>
             </w:r>
           </w:p>
         </w:tc>
@@ -12167,7 +12337,7 @@
                 <w:b w:val="0"/>
                 <w:sz w:val="17"/>
               </w:rPr>
-              <w:t>Pantry Chopping Board</w:t>
+              <w:t>Set/4 White Retro Storage Cubes</w:t>
             </w:r>
           </w:p>
         </w:tc>
@@ -12193,7 +12363,7 @@
                 <w:b w:val="0"/>
                 <w:sz w:val="17"/>
               </w:rPr>
-              <w:t>£4,803</w:t>
+              <w:t>£5,188</w:t>
             </w:r>
           </w:p>
         </w:tc>
@@ -12219,7 +12389,7 @@
                 <w:b w:val="0"/>
                 <w:sz w:val="17"/>
               </w:rPr>
-              <w:t>£5,868</w:t>
+              <w:t>£43,922</w:t>
             </w:r>
           </w:p>
         </w:tc>
@@ -12245,7 +12415,7 @@
                 <w:b w:val="0"/>
                 <w:sz w:val="17"/>
               </w:rPr>
-              <w:t>81.8%</w:t>
+              <w:t>11.8%</w:t>
             </w:r>
           </w:p>
         </w:tc>
@@ -12271,7 +12441,7 @@
                 <w:b w:val="0"/>
                 <w:sz w:val="17"/>
               </w:rPr>
-              <w:t>6</w:t>
+              <w:t>20</w:t>
             </w:r>
           </w:p>
         </w:tc>
@@ -12298,7 +12468,7 @@
                 <w:b w:val="0"/>
                 <w:sz w:val="17"/>
               </w:rPr>
-              <w:t>Doormat Fairy Cake</w:t>
+              <w:t>Pantry Chopping Board</w:t>
             </w:r>
           </w:p>
         </w:tc>
@@ -12324,7 +12494,7 @@
                 <w:b w:val="0"/>
                 <w:sz w:val="17"/>
               </w:rPr>
-              <w:t>£4,650</w:t>
+              <w:t>£4,803</w:t>
             </w:r>
           </w:p>
         </w:tc>
@@ -12350,7 +12520,7 @@
                 <w:b w:val="0"/>
                 <w:sz w:val="17"/>
               </w:rPr>
-              <w:t>£34,519</w:t>
+              <w:t>£5,868</w:t>
             </w:r>
           </w:p>
         </w:tc>
@@ -12376,7 +12546,7 @@
                 <w:b w:val="0"/>
                 <w:sz w:val="17"/>
               </w:rPr>
-              <w:t>13.5%</w:t>
+              <w:t>81.8%</w:t>
             </w:r>
           </w:p>
         </w:tc>
@@ -12459,7 +12629,7 @@
           <w:b/>
           <w:i w:val="0"/>
         </w:rPr>
-        <w:t>3rd</w:t>
+        <w:t>4th</w:t>
       </w:r>
       <w:r>
         <w:rPr>
@@ -12473,21 +12643,21 @@
           <w:b/>
           <w:i w:val="0"/>
         </w:rPr>
-        <w:t>5,320th</w:t>
+        <w:t>4,711th</w:t>
       </w:r>
       <w:r>
         <w:rPr>
           <w:b w:val="0"/>
           <w:i w:val="0"/>
         </w:rPr>
-        <w:t xml:space="preserve">. Medium Ceramic Top Storage Jar moves from 9th to 1,072nd. </w:t>
+        <w:t xml:space="preserve">. Medium Ceramic Top Storage Jar moves from 9th to 1,032nd. </w:t>
       </w:r>
       <w:r>
         <w:rPr>
           <w:b/>
           <w:i w:val="0"/>
         </w:rPr>
-        <w:t>8 of the top ten products change position once returns are netted off.</w:t>
+        <w:t>7 of the top ten products change position once returns are netted off.</w:t>
       </w:r>
       <w:r>
         <w:rPr>
@@ -12662,7 +12832,7 @@
                 <w:b/>
                 <w:sz w:val="19"/>
               </w:rPr>
-              <w:t>Share of revenue</w:t>
+              <w:t>Share of identified revenue</w:t>
             </w:r>
           </w:p>
         </w:tc>
@@ -13070,14 +13240,14 @@
           <w:b/>
           <w:i w:val="0"/>
         </w:rPr>
-        <w:t>1,170 customers produce 77.2% of revenue, and 58 produce 31.9%.</w:t>
+        <w:t>1,170 customers produce 77.2% of identified revenue, and 58 produce 31.9%.</w:t>
       </w:r>
       <w:r>
         <w:rPr>
           <w:b w:val="0"/>
           <w:i w:val="0"/>
         </w:rPr>
-        <w:t xml:space="preserve"> The distribution behind that is extreme: the median customer is worth £889.31, the mean £2,994.22 (3.4x the median), and the largest single customer £608,821.65.</w:t>
+        <w:t xml:space="preserve"> Both shares are measured against the £17,528,150 carried by identified customers, not the £20,517,554 total - as is every other customer-level share in this report. The distribution behind that is extreme: the median customer is worth £889.31, the mean £2,994.22 (3.4x the median), and the largest single customer £608,821.65.</w:t>
       </w:r>
     </w:p>
     <w:p>
@@ -13316,7 +13486,7 @@
                 <w:b/>
                 <w:sz w:val="16"/>
               </w:rPr>
-              <w:t>% of revenue</w:t>
+              <w:t>% of identified revenue</w:t>
             </w:r>
           </w:p>
         </w:tc>
@@ -15332,7 +15502,7 @@
           <w:b w:val="0"/>
           <w:i w:val="0"/>
         </w:rPr>
-        <w:t xml:space="preserve"> customers - 28.3% of the base between them - contribute 3.4% of revenue. They are numerous and nearly worthless, which is exactly why a base-wide campaign wastes most of its budget.</w:t>
+        <w:t xml:space="preserve"> customers - 28.3% of the base between them - contribute 3.4% of identified revenue. They are numerous and nearly worthless, which is exactly why a base-wide campaign wastes most of its budget.</w:t>
       </w:r>
     </w:p>
     <w:p>
@@ -15376,7 +15546,7 @@
           <w:b/>
           <w:i w:val="0"/>
         </w:rPr>
-        <w:t xml:space="preserve"> - 683 accounts - have already spent £1,689,620, which is 9.6% of revenue, and have stopped ordering.</w:t>
+        <w:t xml:space="preserve"> - 683 accounts - have already spent £1,689,620, which is 9.6% of identified revenue, and have stopped ordering.</w:t>
       </w:r>
       <w:r>
         <w:rPr>
@@ -15448,7 +15618,7 @@
           <w:b w:val="0"/>
           <w:i w:val="0"/>
         </w:rPr>
-        <w:t xml:space="preserve"> (440) hold 2.5% of revenue between them - they are where the next cohort of Champions has to come from, and they are cheap to nurture precisely because they are small.</w:t>
+        <w:t xml:space="preserve"> (440) hold 2.5% of identified revenue between them - they are where the next cohort of Champions has to come from, and they are cheap to nurture precisely because they are small.</w:t>
       </w:r>
     </w:p>
     <w:p>
@@ -16223,7 +16393,7 @@
           <w:b w:val="0"/>
           <w:i w:val="0"/>
         </w:rPr>
-        <w:t>. That is a deliberate disagreement with the metric, for a stated reason: two clusters cannot be marketed to differently, so the split would be statistically neater and operationally useless. The elbow in inertia is also around k = 4. The cost of the choice is reported rather than hidden.</w:t>
+        <w:t>. That is a deliberate disagreement with the metric, for a stated reason: two clusters cannot be marketed to differently, so the split would be statistically neater and operationally useless. The elbow in inertia is also around the adopted k. The cost of the choice is reported rather than hidden.</w:t>
       </w:r>
     </w:p>
     <w:p>
@@ -16231,7 +16401,7 @@
         <w:pStyle w:val="Heading2"/>
       </w:pPr>
       <w:r>
-        <w:t>9.2  What the four clusters are</w:t>
+        <w:t>9.2  What the 4 clusters are</w:t>
       </w:r>
     </w:p>
     <w:p>
@@ -16526,7 +16696,7 @@
                 <w:b/>
                 <w:sz w:val="16"/>
               </w:rPr>
-              <w:t>% of revenue</w:t>
+              <w:t>% of identified revenue</w:t>
             </w:r>
           </w:p>
         </w:tc>
@@ -17437,7 +17607,7 @@
           <w:b/>
           <w:i w:val="0"/>
         </w:rPr>
-        <w:t>1,186 “High-value regulars” carry 73.6% of revenue</w:t>
+        <w:t>1,186 “High-value regulars” carry 73.6% of identified revenue</w:t>
       </w:r>
       <w:r>
         <w:rPr>
@@ -17503,7 +17673,21 @@
           <w:b w:val="0"/>
           <w:i w:val="0"/>
         </w:rPr>
-        <w:t xml:space="preserve"> maps 98.4% onto another.</w:t>
+        <w:t xml:space="preserve"> maps 98.4% onto another; the weakest agreement, </w:t>
+      </w:r>
+      <w:r>
+        <w:rPr>
+          <w:b w:val="0"/>
+          <w:i/>
+        </w:rPr>
+        <w:t>Loyal</w:t>
+      </w:r>
+      <w:r>
+        <w:rPr>
+          <w:b w:val="0"/>
+          <w:i w:val="0"/>
+        </w:rPr>
+        <w:t>, is still 60.9%.</w:t>
       </w:r>
     </w:p>
     <w:p>
@@ -17512,7 +17696,7 @@
           <w:b w:val="0"/>
           <w:i w:val="0"/>
         </w:rPr>
-        <w:t>Two independent methods recovering the same structure is evidence that the structure is a property of the data rather than an artefact of the analyst's chosen cut-offs. The practical consequence is that the transparent, explainable RFM rules can be used to run the business, with the clustering standing behind them as validation - which is the opposite of the usual trade-off between interpretability and rigour.</w:t>
+        <w:t>Read carefully, this is agreement between two methods rather than corroboration by two independent bodies of evidence: both read the same three R/F/M features off the same rows, so they cannot disagree about the underlying facts. What they disagree about is where to draw the boundaries - fixed quintile thresholds against distances in a standardised log space - and the fact that 80.5% of customers (4,710 of 5,854) land in their own segment's modal cluster says the group structure survives that change of rule. That is weaker than independent confirmation and still enough for the practical consequence: the transparent, explainable RFM rules can be used to run the business, with the clustering standing behind them as a robustness check.</w:t>
       </w:r>
     </w:p>
     <w:p>
@@ -19216,14 +19400,14 @@
           <w:b/>
           <w:i w:val="0"/>
         </w:rPr>
-        <w:t>£25,125,493 is 2.43x the retailer's actual second-year revenue of £10,324,943.</w:t>
+        <w:t>£25,125,493 is 2.91x the £8,627,354 these same identified customers actually produced in the most recent full year.</w:t>
       </w:r>
       <w:r>
         <w:rPr>
           <w:b w:val="0"/>
           <w:i w:val="0"/>
         </w:rPr>
-        <w:t xml:space="preserve"> The projection assumes every customer keeps buying at their observed rate for a further twelve months, and it carries no churn probability, so a customer who has not ordered for a year is projected forward exactly as confidently as one who ordered last week.</w:t>
+        <w:t xml:space="preserve"> The comparison is deliberately like-for-like: the projection is built on the identified base, so measuring it against the £10,324,943 that includes guest checkouts would credit the model with revenue it never saw and understate the gap to 2.43x. The projection assumes every customer keeps buying at their observed rate for a further twelve months, and it carries no churn probability, so a customer who has not ordered for a year is projected forward exactly as confidently as one who ordered last week.</w:t>
       </w:r>
     </w:p>
     <w:p>
@@ -19255,21 +19439,21 @@
           <w:b w:val="0"/>
           <w:i w:val="0"/>
         </w:rPr>
-        <w:t xml:space="preserve">Two conclusions follow, and both are carried into section 13. The projection is reported as a </w:t>
+        <w:t xml:space="preserve">Two conclusions follow, and both are carried into section 13. The projection is reported as an </w:t>
       </w:r>
       <w:r>
         <w:rPr>
           <w:b/>
           <w:i w:val="0"/>
         </w:rPr>
-        <w:t>per-customer upper bound</w:t>
+        <w:t>upper bound in aggregate</w:t>
       </w:r>
       <w:r>
         <w:rPr>
           <w:b w:val="0"/>
           <w:i w:val="0"/>
         </w:rPr>
-        <w:t xml:space="preserve">, never as a forecast. And every prioritisation decision in this report rests on </w:t>
+        <w:t xml:space="preserve">, and for the dormant accounts that inflate it, never as a forecast - for a genuinely accelerating customer the same assumption is conservative, which is why it is not a per-account ceiling. And every prioritisation decision in this report rests on </w:t>
       </w:r>
       <w:r>
         <w:rPr>
@@ -19351,7 +19535,7 @@
           <w:color w:val="77776F"/>
           <w:sz w:val="17"/>
         </w:rPr>
-        <w:t>Figure 14. Monthly acquisition cohorts against months since acquisition. Blank cells are not yet observable.</w:t>
+        <w:t>Figure 14. Monthly acquisition cohorts against months since acquisition. Blank cells are not yet observable, or fall in the truncated final month.</w:t>
       </w:r>
     </w:p>
     <w:p>
@@ -22989,7 +23173,7 @@
                 <w:b w:val="0"/>
                 <w:sz w:val="17"/>
               </w:rPr>
-              <w:t>8.3%</w:t>
+              <w:t>—</w:t>
             </w:r>
           </w:p>
         </w:tc>
@@ -23512,7 +23696,7 @@
                 <w:b w:val="0"/>
                 <w:sz w:val="17"/>
               </w:rPr>
-              <w:t>14.9%</w:t>
+              <w:t>—</w:t>
             </w:r>
           </w:p>
         </w:tc>
@@ -23852,7 +24036,7 @@
                 <w:b w:val="0"/>
                 <w:sz w:val="17"/>
               </w:rPr>
-              <w:t>14.1%</w:t>
+              <w:t>—</w:t>
             </w:r>
           </w:p>
         </w:tc>
@@ -24159,7 +24343,7 @@
           <w:b/>
           <w:i w:val="0"/>
         </w:rPr>
-        <w:t>20.5% at month 1, 20.7% at month 3, 16.8% at month 6 and 16.7% at month 12</w:t>
+        <w:t>20.8% at month 1, 21.0% at month 3, 17.3% at month 6 and 18.0% at month 12</w:t>
       </w:r>
       <w:r>
         <w:rPr>
@@ -24167,6 +24351,15 @@
           <w:i w:val="0"/>
         </w:rPr>
         <w:t>, excluding the left-censored first cohort. A curve that flattens rather than decaying is the signature of a wholesale reorder cycle: the customers who stay, stay for years.</w:t>
+      </w:r>
+    </w:p>
+    <w:p>
+      <w:r>
+        <w:rPr>
+          <w:b w:val="0"/>
+          <w:i w:val="0"/>
+        </w:rPr>
+        <w:t>Two exclusions are applied before those averages are taken, for the same reason the revenue chart drops the final month. 24 cells of the matrix land in December 2011, which holds 9 December 2011 and therefore nine days rather than a month; a nine-day window measures less reordering than a full one for arithmetic reasons alone, so those cells are treated as not comparable and left blank. Cells to the right of each cohort's own history are absent rather than zero.</w:t>
       </w:r>
     </w:p>
     <w:p>
@@ -24183,7 +24376,7 @@
           <w:b w:val="0"/>
           <w:i w:val="0"/>
         </w:rPr>
-        <w:t>The December 2009 cohort is the largest in the file (953 customers) and it retains far better than any other - because it is not really a cohort. Customers who had been buying before the log opens are recorded as newly acquired in the first month, so an established base is being counted as new. Excluding it moves month-1 retention from 21.1% to 20.5% and month-12 from 18.3% to 16.7%.</w:t>
+        <w:t>The December 2009 cohort is the largest in the file (953 customers) and it retains far better than any other - because it is not really a cohort. Customers who had been buying before the log opens are recorded as newly acquired in the first month, so an established base is being counted as new. Excluding it moves month-1 retention from 21.4% to 20.8% and month-12 from 19.6% to 18.0%.</w:t>
       </w:r>
     </w:p>
     <w:p>
@@ -24199,7 +24392,7 @@
           <w:b/>
           <w:i w:val="0"/>
         </w:rPr>
-        <w:t>+0.682 with the first cohort included and +0.421 without it</w:t>
+        <w:t>+0.668 with the first cohort included and +0.372 without it</w:t>
       </w:r>
       <w:r>
         <w:rPr>
@@ -24230,14 +24423,60 @@
           <w:b/>
           <w:i w:val="0"/>
         </w:rPr>
-        <w:t>Customers acquired in November or December retain at 9.3% by month 3, against 21.9% for customers acquired in any other month</w:t>
+        <w:t>Customers acquired in November or December retain at 9.3% by month 3, against 22.3% for customers acquired in any other month</w:t>
       </w:r>
       <w:r>
         <w:rPr>
           <w:b w:val="0"/>
           <w:i w:val="0"/>
         </w:rPr>
-        <w:t xml:space="preserve"> - a gap of 2.4x. The season that produces the revenue spike produces the retailer's worst customers, and a target that counts peak-season acquisitions as equivalent new relationships is measuring the wrong thing.</w:t>
+        <w:t xml:space="preserve"> - a gap of 2.4x. The season that produces the revenue spike appears to produce the retailer's worst customers, and a target that counts peak-season acquisitions as equivalent new relationships is measuring the wrong thing.</w:t>
+      </w:r>
+    </w:p>
+    <w:p>
+      <w:r>
+        <w:rPr>
+          <w:b w:val="0"/>
+          <w:i w:val="0"/>
+        </w:rPr>
+        <w:t xml:space="preserve">How much weight that carries is a separate question, and the answer is: less than the size of the gap suggests. Section 11.1 excludes the left-censored December 2009 row, and that row is the only other December in the file, so the peak side of this comparison is </w:t>
+      </w:r>
+      <w:r>
+        <w:rPr>
+          <w:b/>
+          <w:i w:val="0"/>
+        </w:rPr>
+        <w:t>2 cohorts - 2010-11, 2010-12 - holding 402 customers between them, 38 of whom ordered again at month 3</w:t>
+      </w:r>
+      <w:r>
+        <w:rPr>
+          <w:b w:val="0"/>
+          <w:i w:val="0"/>
+        </w:rPr>
+        <w:t xml:space="preserve"> - against 18 off-peak cohorts. Every peak customer in it was acquired in a single trading season, so nothing here separates </w:t>
+      </w:r>
+      <w:r>
+        <w:rPr>
+          <w:b w:val="0"/>
+          <w:i/>
+        </w:rPr>
+        <w:t>this</w:t>
+      </w:r>
+      <w:r>
+        <w:rPr>
+          <w:b w:val="0"/>
+          <w:i w:val="0"/>
+        </w:rPr>
+        <w:t xml:space="preserve"> Christmas from Christmas in general.</w:t>
+      </w:r>
+    </w:p>
+    <w:p>
+      <w:r>
+        <w:rPr>
+          <w:b w:val="0"/>
+          <w:i w:val="0"/>
+        </w:rPr>
+        <w:t>There is also a calendar confound. Month 3 for those cohorts falls in 2011-02, 2011-03 - the trough identified in section 7.1, where monthly revenue is 34.7% of the peak. A cohort acquired in November is being asked to reorder in the retailer's quietest weeks, while a cohort acquired in June is asked to reorder in September. Part of the gap is therefore weak seasonal demand rather than weak customers, and this dataset cannot separate the two. The finding is a lead worth testing on the next season, which is how recommendation 5 is written; it is not an established seasonal law.</w:t>
       </w:r>
     </w:p>
     <w:p>
@@ -24297,7 +24536,7 @@
           <w:b/>
           <w:i w:val="0"/>
         </w:rPr>
-        <w:t>1,170 customers (20%) generate 77.2% of revenue. The top 58 customers (1%) generate 31.9%.</w:t>
+        <w:t>1,170 customers (20%) generate 77.2% of identified revenue. The top 58 customers (1%) generate 31.9%.</w:t>
       </w:r>
       <w:r>
         <w:rPr>
@@ -24409,7 +24648,7 @@
           <w:b/>
           <w:i w:val="0"/>
         </w:rPr>
-        <w:t xml:space="preserve"> have already spent £1,689,620 (9.6% of revenue) and have stopped ordering.</w:t>
+        <w:t xml:space="preserve"> have already spent £1,689,620 (9.6% of identified revenue) and have stopped ordering.</w:t>
       </w:r>
       <w:r>
         <w:rPr>
@@ -24484,7 +24723,7 @@
           <w:b/>
           <w:i w:val="0"/>
         </w:rPr>
-        <w:t>3rd</w:t>
+        <w:t>4th</w:t>
       </w:r>
       <w:r>
         <w:rPr>
@@ -24498,21 +24737,21 @@
           <w:b/>
           <w:i w:val="0"/>
         </w:rPr>
-        <w:t>5,320th</w:t>
+        <w:t>4,711th</w:t>
       </w:r>
       <w:r>
         <w:rPr>
           <w:b w:val="0"/>
           <w:i w:val="0"/>
         </w:rPr>
-        <w:t xml:space="preserve">; Medium Ceramic Top Storage Jar falls from 9th to 1,072nd. </w:t>
+        <w:t xml:space="preserve">; Medium Ceramic Top Storage Jar falls from 9th to 1,032nd. </w:t>
       </w:r>
       <w:r>
         <w:rPr>
           <w:b/>
           <w:i w:val="0"/>
         </w:rPr>
-        <w:t>8 of the top ten products change position once returns are netted off.</w:t>
+        <w:t>7 of the top ten products change position once returns are netted off.</w:t>
       </w:r>
       <w:r>
         <w:rPr>
@@ -24527,7 +24766,7 @@
         <w:pStyle w:val="Heading2"/>
       </w:pPr>
       <w:r>
-        <w:t>Finding 4.  Returns cost £1.52M, and the aggregate rate hides the problem</w:t>
+        <w:t>Finding 4.  Returns cost £0.74M, and the aggregate rate hides the problem</w:t>
       </w:r>
     </w:p>
     <w:p>
@@ -24543,21 +24782,21 @@
           <w:b/>
           <w:i w:val="0"/>
         </w:rPr>
-        <w:t>£1,523,788 across 19,432 lines - 7.43% of gross revenue</w:t>
+        <w:t>£738,952 across 18,467 lines - 3.60% of gross revenue</w:t>
       </w:r>
       <w:r>
         <w:rPr>
           <w:b w:val="0"/>
           <w:i w:val="0"/>
         </w:rPr>
-        <w:t xml:space="preserve">, taking £20.52M down to a net £18.99M. The monthly rate averages 6.8% but is not stable: it </w:t>
+        <w:t xml:space="preserve">, taking £20.52M down to a net £19.78M. The monthly rate averages 3.0% but is not stable: it </w:t>
       </w:r>
       <w:r>
         <w:rPr>
           <w:b/>
           <w:i w:val="0"/>
         </w:rPr>
-        <w:t>spikes to 19.05% in January 2011</w:t>
+        <w:t>spikes to 13.30% in January 2011</w:t>
       </w:r>
       <w:r>
         <w:rPr>
@@ -24642,7 +24881,7 @@
         <w:pStyle w:val="Heading2"/>
       </w:pPr>
       <w:r>
-        <w:t>Finding 6.  Growth came from retained customers, not new ones</w:t>
+        <w:t>Finding 6.  The existing base carries the revenue but shrank; new customers covered the gap</w:t>
       </w:r>
     </w:p>
     <w:p>
@@ -24651,7 +24890,7 @@
           <w:b w:val="0"/>
           <w:i w:val="0"/>
         </w:rPr>
-        <w:t xml:space="preserve">Like-for-like years grew </w:t>
+        <w:t xml:space="preserve">On all revenue, like-for-like years grew </w:t>
       </w:r>
       <w:r>
         <w:rPr>
@@ -24665,30 +24904,74 @@
           <w:b w:val="0"/>
           <w:i w:val="0"/>
         </w:rPr>
-        <w:t xml:space="preserve"> (£9.56M to £10.32M). But in the second year, </w:t>
+        <w:t xml:space="preserve"> (£9.56M to £10.32M). Underneath that, two questions get confused, so both are answered on the identified base. </w:t>
       </w:r>
       <w:r>
         <w:rPr>
           <w:b/>
           <w:i w:val="0"/>
         </w:rPr>
-        <w:t>91.6% of identified revenue came from customers acquired earlier.</w:t>
+        <w:t>Repeat buying dominates the level:</w:t>
       </w:r>
       <w:r>
         <w:rPr>
           <w:b w:val="0"/>
           <w:i w:val="0"/>
         </w:rPr>
-        <w:t xml:space="preserve"> New customers contributed the remaining 8.4%.</w:t>
+        <w:t xml:space="preserve"> in the second year 91.3% of identified revenue came from customers who had already ordered in an earlier month, and only 8.7% from customers in their first month.</w:t>
       </w:r>
     </w:p>
     <w:p>
       <w:r>
         <w:rPr>
+          <w:b/>
+          <w:i w:val="0"/>
+        </w:rPr>
+        <w:t>Acquisition, not retention, produced the growth.</w:t>
+      </w:r>
+      <w:r>
+        <w:rPr>
           <w:b w:val="0"/>
           <w:i w:val="0"/>
         </w:rPr>
-        <w:t>Growth is being produced by the existing base, which raises the cost of losing any part of it and makes finding 2's at-risk pool the most expensive problem on this list.</w:t>
+        <w:t xml:space="preserve"> Split by acquisition cohort, identified revenue went from £8,384,041 to £8,627,354 - a rise of just </w:t>
+      </w:r>
+      <w:r>
+        <w:rPr>
+          <w:b/>
+          <w:i w:val="0"/>
+        </w:rPr>
+        <w:t>£243,313 (2.9%)</w:t>
+      </w:r>
+      <w:r>
+        <w:rPr>
+          <w:b w:val="0"/>
+          <w:i w:val="0"/>
+        </w:rPr>
+        <w:t xml:space="preserve"> - made up of </w:t>
+      </w:r>
+      <w:r>
+        <w:rPr>
+          <w:b/>
+          <w:i w:val="0"/>
+        </w:rPr>
+        <w:t>£1,491,334 from customers first acquired during year 2, against a £1,248,022 decline in the year-1 base.</w:t>
+      </w:r>
+      <w:r>
+        <w:rPr>
+          <w:b w:val="0"/>
+          <w:i w:val="0"/>
+        </w:rPr>
+        <w:t xml:space="preserve"> Customers acquired before year 2 still supplied 82.7% of its revenue, but less of it than the year before.</w:t>
+      </w:r>
+    </w:p>
+    <w:p>
+      <w:r>
+        <w:rPr>
+          <w:b w:val="0"/>
+          <w:i w:val="0"/>
+        </w:rPr>
+        <w:t>So the existing base is where the money is, and it is leaking. That is a stronger reason to act on finding 2's at-risk pool than "growth came from retention" would have been: the decline is already in the totals.</w:t>
       </w:r>
     </w:p>
     <w:p>
@@ -24712,7 +24995,7 @@
           <w:b/>
           <w:i w:val="0"/>
         </w:rPr>
-        <w:t>20.5% at month 1, 20.7% at month 3, 16.8% at month 6, 16.7% at month 12</w:t>
+        <w:t>20.8% at month 1, 21.0% at month 3, 17.3% at month 6, 18.0% at month 12</w:t>
       </w:r>
       <w:r>
         <w:rPr>
@@ -24735,14 +25018,44 @@
           <w:b/>
           <w:i w:val="0"/>
         </w:rPr>
-        <w:t>customers acquired in November or December retain at 9.3% by month 3, against 21.9% for customers acquired in any other month</w:t>
+        <w:t>customers acquired in November or December retain at 9.3% by month 3, against 22.3% for customers acquired in any other month</w:t>
       </w:r>
       <w:r>
         <w:rPr>
           <w:b w:val="0"/>
           <w:i w:val="0"/>
         </w:rPr>
-        <w:t xml:space="preserve"> - less than half. The peak season that produces the revenue spike produces the retailer's worst customers.</w:t>
+        <w:t xml:space="preserve"> - less than half. The peak season that produces the revenue spike appears to produce the retailer's worst customers.</w:t>
+      </w:r>
+    </w:p>
+    <w:p>
+      <w:r>
+        <w:rPr>
+          <w:b/>
+          <w:i w:val="0"/>
+        </w:rPr>
+        <w:t>How thin this one is.</w:t>
+      </w:r>
+      <w:r>
+        <w:rPr>
+          <w:b w:val="0"/>
+          <w:i w:val="0"/>
+        </w:rPr>
+        <w:t xml:space="preserve"> Excluding the left-censored December 2009 row also excludes the only other December in the file, so the peak side is </w:t>
+      </w:r>
+      <w:r>
+        <w:rPr>
+          <w:b/>
+          <w:i w:val="0"/>
+        </w:rPr>
+        <w:t>2 cohorts (2010-11, 2010-12), 402 customers, 38 of whom reordered at month 3</w:t>
+      </w:r>
+      <w:r>
+        <w:rPr>
+          <w:b w:val="0"/>
+          <w:i w:val="0"/>
+        </w:rPr>
+        <w:t xml:space="preserve"> - against 18 off-peak cohorts, and all from one Christmas. Their month 3 falls in 2011-02, 2011-03, the calendar trough, so weak seasonal demand and weak customers are confounded. It is a hypothesis worth a controlled test, not an established seasonal law.</w:t>
       </w:r>
     </w:p>
     <w:p>
@@ -24801,7 +25114,51 @@
           <w:b w:val="0"/>
           <w:i w:val="0"/>
         </w:rPr>
-        <w:t xml:space="preserve"> maps 98.4% onto another. Two independent methods recovering the same structure is evidence the structure is in the data rather than in the analyst's choice of thresholds.</w:t>
+        <w:t xml:space="preserve"> maps 98.4% onto another; the weakest is </w:t>
+      </w:r>
+      <w:r>
+        <w:rPr>
+          <w:b w:val="0"/>
+          <w:i/>
+        </w:rPr>
+        <w:t>Loyal</w:t>
+      </w:r>
+      <w:r>
+        <w:rPr>
+          <w:b w:val="0"/>
+          <w:i w:val="0"/>
+        </w:rPr>
+        <w:t xml:space="preserve"> at 60.9%. At customer level </w:t>
+      </w:r>
+      <w:r>
+        <w:rPr>
+          <w:b/>
+          <w:i w:val="0"/>
+        </w:rPr>
+        <w:t>80.5% of accounts (4,710) sit in their own segment's modal cluster.</w:t>
+      </w:r>
+    </w:p>
+    <w:p>
+      <w:r>
+        <w:rPr>
+          <w:b w:val="0"/>
+          <w:i w:val="0"/>
+        </w:rPr>
+        <w:t xml:space="preserve">What that does and does not prove: the two methods are </w:t>
+      </w:r>
+      <w:r>
+        <w:rPr>
+          <w:b/>
+          <w:i w:val="0"/>
+        </w:rPr>
+        <w:t>not independent evidence in the strong sense</w:t>
+      </w:r>
+      <w:r>
+        <w:rPr>
+          <w:b w:val="0"/>
+          <w:i w:val="0"/>
+        </w:rPr>
+        <w:t>, because both read the same three R/F/M features off the same rows. What differs is how the boundaries are drawn - fixed quintile thresholds against distances in a standardised space - so the agreement shows the structure does not depend on the thresholds chosen, which is the specific thing worth knowing about a hand-built segmentation.</w:t>
       </w:r>
     </w:p>
     <w:p>
@@ -25018,7 +25375,7 @@
           <w:b w:val="0"/>
           <w:i w:val="0"/>
         </w:rPr>
-        <w:t xml:space="preserve"> Without one, any subsequent recovery is indistinguishable from customers who would have reordered regardless - and given the flat 16.7% month-12 reorder rate in finding 7, a meaningful fraction would have.</w:t>
+        <w:t xml:space="preserve"> Without one, any subsequent recovery is indistinguishable from customers who would have reordered regardless - and given the flat 18.0% month-12 reorder rate in finding 7, a meaningful fraction would have.</w:t>
       </w:r>
     </w:p>
     <w:p>
@@ -25049,7 +25406,7 @@
           <w:b/>
           <w:i w:val="0"/>
         </w:rPr>
-        <w:t>71.5% of revenue</w:t>
+        <w:t>71.5% of identified revenue</w:t>
       </w:r>
       <w:r>
         <w:rPr>
@@ -25063,7 +25420,7 @@
           <w:b/>
           <w:i w:val="0"/>
         </w:rPr>
-        <w:t>91.6% of second-year revenue came from previously-acquired customers</w:t>
+        <w:t>82.7% of second-year revenue came from customers acquired before that year began</w:t>
       </w:r>
       <w:r>
         <w:rPr>
@@ -25077,7 +25434,7 @@
           <w:b/>
           <w:i w:val="0"/>
         </w:rPr>
-        <w:t>31.9% of revenue</w:t>
+        <w:t>31.9% of identified revenue</w:t>
       </w:r>
       <w:r>
         <w:rPr>
@@ -25093,7 +25450,7 @@
           <w:b w:val="0"/>
           <w:i w:val="0"/>
         </w:rPr>
-        <w:t>Concretely: guaranteed stock availability on their repeat lines through the September-November peak, and a named contact. The defensive case is stronger than any acquisition case on this data, because acquisition is demonstrably not what is producing growth.</w:t>
+        <w:t>Concretely: guaranteed stock availability on their repeat lines through the September-November peak, and a named contact. The defensive case is not that the existing base is growing - finding 6 shows it fell by £1,248,022 in year 2 - it is that the base still carries more than four fifths of the revenue while it declines. Retention work here defends a larger number than acquisition work adds, and the at-risk pool in finding 2 is where that decline is already visible.</w:t>
       </w:r>
     </w:p>
     <w:p>
@@ -25117,7 +25474,7 @@
           <w:b w:val="0"/>
           <w:i w:val="0"/>
         </w:rPr>
-        <w:t xml:space="preserve"> 8 of the top ten products change rank once cancellations are netted off, and the gross-rank-3 product is genuinely 5,320th. Every product report should net cancellations against the original sale.</w:t>
+        <w:t xml:space="preserve"> 7 of the top ten products change rank once cancellations are netted off, and the gross-rank-4 product is genuinely 4,711th. Every product report should net cancellations against the original sale.</w:t>
       </w:r>
     </w:p>
     <w:p>
@@ -25157,14 +25514,14 @@
           <w:b/>
           <w:i w:val="0"/>
         </w:rPr>
-        <w:t>19.05% in January 2011</w:t>
+        <w:t>13.30% in January 2011</w:t>
       </w:r>
       <w:r>
         <w:rPr>
           <w:b w:val="0"/>
           <w:i w:val="0"/>
         </w:rPr>
-        <w:t xml:space="preserve"> against a 6.8% average. Two actions follow: provision warehouse and refund capacity for a post-Christmas spike rather than an even monthly rate, and inspect the concentrated returned lines in section 7.7 for a cause.</w:t>
+        <w:t xml:space="preserve"> against a 3.0% average. Two actions follow: provision warehouse and refund capacity for a post-Christmas spike rather than an even monthly rate, and inspect the concentrated returned lines in section 7.7 for a cause.</w:t>
       </w:r>
     </w:p>
     <w:p>
@@ -25232,28 +25589,37 @@
           <w:b/>
           <w:i w:val="0"/>
         </w:rPr>
-        <w:t>9.3% by month 3 versus 21.9%</w:t>
+        <w:t>9.3% by month 3 versus 22.3%</w:t>
       </w:r>
       <w:r>
         <w:rPr>
           <w:b w:val="0"/>
           <w:i w:val="0"/>
         </w:rPr>
-        <w:t xml:space="preserve"> otherwise. The peak should be run as a volume and cash-generation event, and peak-acquired customers should </w:t>
+        <w:t xml:space="preserve"> otherwise - on 2 peak cohorts totalling 402 customers from a single Christmas, whose month 3 falls in the calendar trough.</w:t>
+      </w:r>
+    </w:p>
+    <w:p>
+      <w:r>
+        <w:rPr>
+          <w:b w:val="0"/>
+          <w:i w:val="0"/>
+        </w:rPr>
+        <w:t xml:space="preserve">That evidence supports a </w:t>
       </w:r>
       <w:r>
         <w:rPr>
           <w:b/>
           <w:i w:val="0"/>
         </w:rPr>
-        <w:t>not</w:t>
+        <w:t>test</w:t>
       </w:r>
       <w:r>
         <w:rPr>
           <w:b w:val="0"/>
           <w:i w:val="0"/>
         </w:rPr>
-        <w:t xml:space="preserve"> be counted as new relationships in any target that assumes they behave like the rest of the base.</w:t>
+        <w:t>, not a reallocation of budget. Tag peak-acquired customers on arrival and measure their month-3 reorder rate against an off-peak control over the coming season; if the gap survives a second Christmas with the seasonal effect controlled for, then move acquisition spend out of the peak.</w:t>
       </w:r>
     </w:p>
     <w:p>
@@ -25262,7 +25628,7 @@
           <w:b w:val="0"/>
           <w:i w:val="0"/>
         </w:rPr>
-        <w:t>The corollary is to spend acquisition budget outside the peak, where the customers who arrive are more than twice as likely to still be buying at month 3.</w:t>
+        <w:t>The half of this that is safe now costs nothing: stop counting peak-acquired customers as new relationships in any target that assumes they behave like the rest of the base, and run the peak as a volume and cash-generation event.</w:t>
       </w:r>
     </w:p>
     <w:p>
@@ -25449,7 +25815,7 @@
           <w:b w:val="0"/>
           <w:i w:val="0"/>
         </w:rPr>
-        <w:t xml:space="preserve"> It sums to 2.43x actual second-year revenue (section 10.1). It is an upper bound per account, nothing more.</w:t>
+        <w:t xml:space="preserve"> It sums to 2.91x actual second-year revenue (section 10.1). Summed across the base it is an upper bound, nothing more; for one accelerating account it can equally be too low.</w:t>
       </w:r>
     </w:p>
     <w:p>
@@ -25575,7 +25941,7 @@
           <w:b w:val="0"/>
           <w:i w:val="0"/>
         </w:rPr>
-        <w:t xml:space="preserve"> Summed across the base it is 2.43x actual second-year revenue, and it ranks a dormant segment above Champions. It carries no churn probability, so it should be read only as a per-customer upper bound. BG/NBD plus a Gamma-Gamma spend model is the correct fix and is not done here; prioritisation in section 13 therefore rests on historical value.</w:t>
+        <w:t xml:space="preserve"> Summed across the base it is 2.91x actual second-year revenue, and it ranks a dormant segment above Champions. It carries no churn probability, so it should be read as an aggregate upper bound - the constant-rate assumption is optimistic for a dormant account and conservative for an accelerating one, so it is not a ceiling on any single customer. BG/NBD plus a Gamma-Gamma spend model is the correct fix and is not done here; prioritisation in section 13 therefore rests on historical value.</w:t>
       </w:r>
     </w:p>
     <w:p>
@@ -25834,6 +26200,74 @@
       </w:r>
     </w:p>
     <w:p>
+      <w:pPr>
+        <w:spacing w:after="100"/>
+        <w:ind w:left="425" w:hanging="425"/>
+      </w:pPr>
+      <w:r>
+        <w:rPr>
+          <w:b/>
+          <w:i w:val="0"/>
+        </w:rPr>
+        <w:t>10.</w:t>
+      </w:r>
+      <w:r>
+        <w:rPr>
+          <w:b w:val="0"/>
+          <w:i w:val="0"/>
+        </w:rPr>
+        <w:t xml:space="preserve"> </w:t>
+      </w:r>
+      <w:r>
+        <w:rPr>
+          <w:b/>
+          <w:i w:val="0"/>
+        </w:rPr>
+        <w:t>The Christmas retention gap rests on one season.</w:t>
+      </w:r>
+      <w:r>
+        <w:rPr>
+          <w:b w:val="0"/>
+          <w:i w:val="0"/>
+        </w:rPr>
+        <w:t xml:space="preserve"> Excluding the left-censored December 2009 row also removes the only other December in the file, so the peak side of the 9.3%-versus-22.3% comparison is 2 cohorts (2010-11, 2010-12), 402 customers, 38 of whom reordered at month 3. Their month 3 falls in 2011-02, 2011-03, the February-March trough, so seasonal demand and customer quality are confounded and this data cannot separate them. Finding 7 is a hypothesis to test; recommendation 5 is written as a test rather than a decision.</w:t>
+      </w:r>
+    </w:p>
+    <w:p>
+      <w:pPr>
+        <w:spacing w:after="100"/>
+        <w:ind w:left="425" w:hanging="425"/>
+      </w:pPr>
+      <w:r>
+        <w:rPr>
+          <w:b/>
+          <w:i w:val="0"/>
+        </w:rPr>
+        <w:t>11.</w:t>
+      </w:r>
+      <w:r>
+        <w:rPr>
+          <w:b w:val="0"/>
+          <w:i w:val="0"/>
+        </w:rPr>
+        <w:t xml:space="preserve"> </w:t>
+      </w:r>
+      <w:r>
+        <w:rPr>
+          <w:b/>
+          <w:i w:val="0"/>
+        </w:rPr>
+        <w:t>The return rate depends on which credit notes count as returns.</w:t>
+      </w:r>
+      <w:r>
+        <w:rPr>
+          <w:b w:val="0"/>
+          <w:i w:val="0"/>
+        </w:rPr>
+        <w:t xml:space="preserve"> The 3.60% figure counts customer returns of products and carriage only, so that its numerator and the gross-revenue denominator describe the same population. Including the administrative reversals - manual adjustments, Amazon fees, bank charges, discounts, samples - would give 7.43% on £1,523,788, but those stock codes are removed from the revenue base by cleaning step 7 and are not customers sending goods back. Both numbers appear in section 7.7; neither is the single true rate without saying which question is being asked.</w:t>
+      </w:r>
+    </w:p>
+    <w:p>
       <w:r>
         <w:br w:type="page"/>
       </w:r>
@@ -25852,7 +26286,7 @@
           <w:b w:val="0"/>
           <w:i w:val="0"/>
         </w:rPr>
-        <w:t>The project set out to turn a flat transaction log into a picture of a customer base, and the picture is sharper than the aggregate figures suggest. £20,517,554 of revenue and 5,854 identified customers resolve into a business that depends on a few hundred accounts: 1,170 customers carry 77.2% of revenue, 1,555 Champions carry 71.5%, and 91.6% of second-year revenue came from customers who were already there.</w:t>
+        <w:t>The project set out to turn a flat transaction log into a picture of a customer base, and the picture is sharper than the aggregate figures suggest. £20,517,554 of revenue and 5,854 identified customers resolve into a business that depends on a few hundred accounts: 1,170 customers carry 77.2% of identified revenue, 1,555 Champions carry 71.5%, and 82.7% of second-year revenue came from customers who were already there - a base that nonetheless spent £1,248,022 less than it had the year before.</w:t>
       </w:r>
     </w:p>
     <w:p>
@@ -25861,7 +26295,7 @@
           <w:b w:val="0"/>
           <w:i w:val="0"/>
         </w:rPr>
-        <w:t>That structure was recovered twice, by methods that share no assumptions: an explicit RFM rule ladder and an unsupervised K-Means clustering that was given no rules at all. Their agreement - every segment sending at least 60% of its members to one cluster - is the strongest evidence in the report that the segmentation describes the business rather than the analyst.</w:t>
+        <w:t>That structure was recovered twice: by an explicit RFM rule ladder and by an unsupervised K-Means clustering that was given no rules at all. The two are not independent in the strong sense - both read the same three features off the same rows - but they draw their boundaries in completely different ways, so their agreement (80.5% of customers in their own segment's modal cluster, every segment above 60%) is good evidence that the segmentation follows the data rather than the thresholds the analyst picked.</w:t>
       </w:r>
     </w:p>
     <w:p>
@@ -25915,7 +26349,37 @@
           <w:b w:val="0"/>
           <w:i w:val="0"/>
         </w:rPr>
-        <w:t>From a clone of the repository, on any machine with Python 3.10 or newer:</w:t>
+        <w:t xml:space="preserve">From a clone of the repository. The analysis was developed and run on </w:t>
+      </w:r>
+      <w:r>
+        <w:rPr>
+          <w:b/>
+          <w:i w:val="0"/>
+        </w:rPr>
+        <w:t>Python 3.14.6</w:t>
+      </w:r>
+      <w:r>
+        <w:rPr>
+          <w:b w:val="0"/>
+          <w:i w:val="0"/>
+        </w:rPr>
+        <w:t xml:space="preserve"> under Windows 11; the bounds in </w:t>
+      </w:r>
+      <w:r>
+        <w:rPr>
+          <w:rFonts w:ascii="Consolas" w:hAnsi="Consolas"/>
+          <w:b w:val="0"/>
+          <w:i w:val="0"/>
+          <w:sz w:val="19"/>
+        </w:rPr>
+        <w:t>requirements.txt</w:t>
+      </w:r>
+      <w:r>
+        <w:rPr>
+          <w:b w:val="0"/>
+          <w:i w:val="0"/>
+        </w:rPr>
+        <w:t xml:space="preserve"> are the oldest releases whose APIs the code uses, but no other version was exercised:</w:t>
       </w:r>
     </w:p>
     <w:p>
@@ -25930,6 +26394,22 @@
           <w:i w:val="0"/>
           <w:sz w:val="19"/>
         </w:rPr>
+        <w:t>python -m venv .venv</w:t>
+      </w:r>
+      <w:r>
+        <w:rPr>
+          <w:b w:val="0"/>
+          <w:i w:val="0"/>
+        </w:rPr>
+        <w:t xml:space="preserve"> and activate it, then </w:t>
+      </w:r>
+      <w:r>
+        <w:rPr>
+          <w:rFonts w:ascii="Consolas" w:hAnsi="Consolas"/>
+          <w:b w:val="0"/>
+          <w:i w:val="0"/>
+          <w:sz w:val="19"/>
+        </w:rPr>
         <w:t>pip install -r requirements.txt</w:t>
       </w:r>
     </w:p>
@@ -25965,7 +26445,7 @@
           <w:b w:val="0"/>
           <w:i w:val="0"/>
         </w:rPr>
-        <w:t xml:space="preserve">. The first run downloads the 45 MB source workbook from UCI into </w:t>
+        <w:t xml:space="preserve">. The first run downloads the 45.6 MB source workbook from UCI into </w:t>
       </w:r>
       <w:r>
         <w:rPr>
@@ -25981,7 +26461,35 @@
           <w:b w:val="0"/>
           <w:i w:val="0"/>
         </w:rPr>
-        <w:t xml:space="preserve"> and caches it; later runs read the cache. Expect several minutes, most of it spent reading the .xlsx file.</w:t>
+        <w:t xml:space="preserve"> and caches both sheets as a CSV; later runs read the cache. Measured on the development machine, the first run takes </w:t>
+      </w:r>
+      <w:r>
+        <w:rPr>
+          <w:b/>
+          <w:i w:val="0"/>
+        </w:rPr>
+        <w:t>1 min 28 s</w:t>
+      </w:r>
+      <w:r>
+        <w:rPr>
+          <w:b w:val="0"/>
+          <w:i w:val="0"/>
+        </w:rPr>
+        <w:t xml:space="preserve"> and later runs </w:t>
+      </w:r>
+      <w:r>
+        <w:rPr>
+          <w:b/>
+          <w:i w:val="0"/>
+        </w:rPr>
+        <w:t>33 s</w:t>
+      </w:r>
+      <w:r>
+        <w:rPr>
+          <w:b w:val="0"/>
+          <w:i w:val="0"/>
+        </w:rPr>
+        <w:t>, excluding the download - UCI's throughput varies from about 30 seconds to several minutes.</w:t>
       </w:r>
     </w:p>
     <w:p>
@@ -26044,7 +26552,7 @@
           <w:b w:val="0"/>
           <w:i w:val="0"/>
         </w:rPr>
-        <w:t xml:space="preserve"> (196 facts plus the segment, cluster, cohort and product tables). This report reads only those two locations, so the document and the analysis cannot disagree.</w:t>
+        <w:t xml:space="preserve"> (236 facts plus the segment, cluster, cohort and product tables). This report reads only those two locations, so the document and the analysis cannot disagree.</w:t>
       </w:r>
     </w:p>
     <w:p>

</xml_diff>